<commit_message>
docs(pda): incorporar referencias bibliograficas formales en formato Word y README
</commit_message>
<xml_diff>
--- a/PDA/Documentos de convocatoria Generación Estrella/40202_solicitud-de-microsubsidio_generacion-estrella-2026.docx
+++ b/PDA/Documentos de convocatoria Generación Estrella/40202_solicitud-de-microsubsidio_generacion-estrella-2026.docx
@@ -931,6 +931,236 @@
                 <w:sz w:val="20"/>
               </w:rPr>
               <w:t>Un diagnóstico inédito de perfiles atmosféricos y fotogramétricos rurales en datos abiertos para La Estrella; validación de la tecnología de siembra aérea protegida para taludes inaccesibles; y capacidades instaladas en jóvenes de colegio público formados en ciencias STEAM y acción ambiental.</w:t>
+            </w:r>
+          </w:p>
+          <w:p>
+            <w:pPr>
+              <w:spacing w:before="120" w:after="60"/>
+            </w:pPr>
+            <w:r>
+              <w:rPr>
+                <w:rFonts w:ascii="Calibri" w:hAnsi="Calibri"/>
+                <w:b/>
+                <w:color w:val="1E3A8A"/>
+                <w:sz w:val="20"/>
+              </w:rPr>
+              <w:t>6. Referencias Bibliográficas y Normativas:</w:t>
+            </w:r>
+          </w:p>
+          <w:p>
+            <w:pPr>
+              <w:spacing w:after="40" w:line="276" w:lineRule="auto"/>
+            </w:pPr>
+            <w:r>
+              <w:rPr>
+                <w:rFonts w:ascii="Calibri" w:hAnsi="Calibri"/>
+                <w:sz w:val="17"/>
+              </w:rPr>
+              <w:t xml:space="preserve">• Área Metropolitana del Valle de Aburrá [AMVA] &amp; Universidad Nacional de Colombia. (2018). </w:t>
+            </w:r>
+            <w:r>
+              <w:rPr>
+                <w:rFonts w:ascii="Calibri" w:hAnsi="Calibri"/>
+                <w:i/>
+                <w:sz w:val="17"/>
+              </w:rPr>
+              <w:t xml:space="preserve">Estudio de variabilidad microclimática, islas de calor y coberturas vegetales en el Valle de Aburrá. </w:t>
+            </w:r>
+            <w:r>
+              <w:rPr>
+                <w:rFonts w:ascii="Calibri" w:hAnsi="Calibri"/>
+                <w:sz w:val="17"/>
+              </w:rPr>
+              <w:t>Medellín: AMVA.</w:t>
+            </w:r>
+          </w:p>
+          <w:p>
+            <w:pPr>
+              <w:spacing w:after="40" w:line="276" w:lineRule="auto"/>
+            </w:pPr>
+            <w:r>
+              <w:rPr>
+                <w:rFonts w:ascii="Calibri" w:hAnsi="Calibri"/>
+                <w:sz w:val="17"/>
+              </w:rPr>
+              <w:t xml:space="preserve">• Corantioquia. (2019). </w:t>
+            </w:r>
+            <w:r>
+              <w:rPr>
+                <w:rFonts w:ascii="Calibri" w:hAnsi="Calibri"/>
+                <w:i/>
+                <w:sz w:val="17"/>
+              </w:rPr>
+              <w:t xml:space="preserve">Plan de Manejo Ambiental del Distrito de Manejo Integrado (DMI) Cuchilla del Romeral. </w:t>
+            </w:r>
+            <w:r>
+              <w:rPr>
+                <w:rFonts w:ascii="Calibri" w:hAnsi="Calibri"/>
+                <w:sz w:val="17"/>
+              </w:rPr>
+              <w:t>Corporación Autónoma Regional del Centro de Antioquia.</w:t>
+            </w:r>
+          </w:p>
+          <w:p>
+            <w:pPr>
+              <w:spacing w:after="40" w:line="276" w:lineRule="auto"/>
+            </w:pPr>
+            <w:r>
+              <w:rPr>
+                <w:rFonts w:ascii="Calibri" w:hAnsi="Calibri"/>
+                <w:sz w:val="17"/>
+              </w:rPr>
+              <w:t xml:space="preserve">• Escobedo, F. J., Kroeger, T., &amp; Wagner, J. E. (2011). </w:t>
+            </w:r>
+            <w:r>
+              <w:rPr>
+                <w:rFonts w:ascii="Calibri" w:hAnsi="Calibri"/>
+                <w:i/>
+                <w:sz w:val="17"/>
+              </w:rPr>
+              <w:t xml:space="preserve">Urban forests and pollution mitigation: Analyzing ecosystem services and disservices. </w:t>
+            </w:r>
+            <w:r>
+              <w:rPr>
+                <w:rFonts w:ascii="Calibri" w:hAnsi="Calibri"/>
+                <w:sz w:val="17"/>
+              </w:rPr>
+              <w:t>Environmental Pollution, 159(8-9), 2078-2087. https://doi.org/10.1016/j.envpol.2011.01.010</w:t>
+            </w:r>
+          </w:p>
+          <w:p>
+            <w:pPr>
+              <w:spacing w:after="40" w:line="276" w:lineRule="auto"/>
+            </w:pPr>
+            <w:r>
+              <w:rPr>
+                <w:rFonts w:ascii="Calibri" w:hAnsi="Calibri"/>
+                <w:sz w:val="17"/>
+              </w:rPr>
+              <w:t xml:space="preserve">• Fukuoka, M. (1978). </w:t>
+            </w:r>
+            <w:r>
+              <w:rPr>
+                <w:rFonts w:ascii="Calibri" w:hAnsi="Calibri"/>
+                <w:i/>
+                <w:sz w:val="17"/>
+              </w:rPr>
+              <w:t xml:space="preserve">The One-Straw Revolution: An Introduction to Natural Farming (Técnica de Nendo Dango). </w:t>
+            </w:r>
+            <w:r>
+              <w:rPr>
+                <w:rFonts w:ascii="Calibri" w:hAnsi="Calibri"/>
+                <w:sz w:val="17"/>
+              </w:rPr>
+              <w:t>Rodale Press.</w:t>
+            </w:r>
+          </w:p>
+          <w:p>
+            <w:pPr>
+              <w:spacing w:after="40" w:line="276" w:lineRule="auto"/>
+            </w:pPr>
+            <w:r>
+              <w:rPr>
+                <w:rFonts w:ascii="Calibri" w:hAnsi="Calibri"/>
+                <w:sz w:val="17"/>
+              </w:rPr>
+              <w:t xml:space="preserve">• García-Fayos, P., Bochet, E., &amp; Cerdà, A. (2020). </w:t>
+            </w:r>
+            <w:r>
+              <w:rPr>
+                <w:rFonts w:ascii="Calibri" w:hAnsi="Calibri"/>
+                <w:i/>
+                <w:sz w:val="17"/>
+              </w:rPr>
+              <w:t xml:space="preserve">Seed pelleting and soil erosion control: Enhancing restoration success on degraded steep slopes. </w:t>
+            </w:r>
+            <w:r>
+              <w:rPr>
+                <w:rFonts w:ascii="Calibri" w:hAnsi="Calibri"/>
+                <w:sz w:val="17"/>
+              </w:rPr>
+              <w:t>Ecological Engineering, 148, 105789. https://doi.org/10.1016/j.ecoleng.2020.105789</w:t>
+            </w:r>
+          </w:p>
+          <w:p>
+            <w:pPr>
+              <w:spacing w:after="40" w:line="276" w:lineRule="auto"/>
+            </w:pPr>
+            <w:r>
+              <w:rPr>
+                <w:rFonts w:ascii="Calibri" w:hAnsi="Calibri"/>
+                <w:sz w:val="17"/>
+              </w:rPr>
+              <w:t xml:space="preserve">• Municipio de La Estrella. (2024). </w:t>
+            </w:r>
+            <w:r>
+              <w:rPr>
+                <w:rFonts w:ascii="Calibri" w:hAnsi="Calibri"/>
+                <w:i/>
+                <w:sz w:val="17"/>
+              </w:rPr>
+              <w:t xml:space="preserve">Plan de Desarrollo Municipal 2024-2027: 'La Estrella, Municipio Verde y Sostenible'. </w:t>
+            </w:r>
+            <w:r>
+              <w:rPr>
+                <w:rFonts w:ascii="Calibri" w:hAnsi="Calibri"/>
+                <w:sz w:val="17"/>
+              </w:rPr>
+              <w:t>Alcaldía Municipal de La Estrella.</w:t>
+            </w:r>
+          </w:p>
+          <w:p>
+            <w:pPr>
+              <w:spacing w:after="40" w:line="276" w:lineRule="auto"/>
+            </w:pPr>
+            <w:r>
+              <w:rPr>
+                <w:rFonts w:ascii="Calibri" w:hAnsi="Calibri"/>
+                <w:sz w:val="17"/>
+              </w:rPr>
+              <w:t xml:space="preserve">• Nowak, D. J., Hirabayashi, S., Bodine, A., &amp; Greenfield, E. (2014). </w:t>
+            </w:r>
+            <w:r>
+              <w:rPr>
+                <w:rFonts w:ascii="Calibri" w:hAnsi="Calibri"/>
+                <w:i/>
+                <w:sz w:val="17"/>
+              </w:rPr>
+              <w:t xml:space="preserve">Tree and forest effects on air quality and human health in the United States. </w:t>
+            </w:r>
+            <w:r>
+              <w:rPr>
+                <w:rFonts w:ascii="Calibri" w:hAnsi="Calibri"/>
+                <w:sz w:val="17"/>
+              </w:rPr>
+              <w:t>Environmental Pollution, 193, 119-129. https://doi.org/10.1016/j.envpol.2014.05.028</w:t>
+            </w:r>
+          </w:p>
+          <w:p>
+            <w:pPr>
+              <w:spacing w:after="40" w:line="276" w:lineRule="auto"/>
+            </w:pPr>
+            <w:r>
+              <w:rPr>
+                <w:rFonts w:ascii="Calibri" w:hAnsi="Calibri"/>
+                <w:sz w:val="17"/>
+              </w:rPr>
+              <w:t xml:space="preserve">• Sistema de Alerta Temprana de Medellín y el Valle de Aburrá [SIATA]. (2023). </w:t>
+            </w:r>
+            <w:r>
+              <w:rPr>
+                <w:rFonts w:ascii="Calibri" w:hAnsi="Calibri"/>
+                <w:i/>
+                <w:sz w:val="17"/>
+              </w:rPr>
+              <w:t xml:space="preserve">Dinámica de dispersión de contaminantes, perfiles verticales y red de monitoreo ciudadano en la cuenca del Valle de Aburrá. </w:t>
+            </w:r>
+            <w:r>
+              <w:rPr>
+                <w:rFonts w:ascii="Calibri" w:hAnsi="Calibri"/>
+                <w:sz w:val="17"/>
+              </w:rPr>
+              <w:t>Medellín: AMVA / SIATA.</w:t>
             </w:r>
           </w:p>
         </w:tc>

</xml_diff>